<commit_message>
Added Timesheet Processing service
</commit_message>
<xml_diff>
--- a/Documentation/Technical Specifications/Deployment Documentation/KEN Deployment Procedures.docx
+++ b/Documentation/Technical Specifications/Deployment Documentation/KEN Deployment Procedures.docx
@@ -138,10 +138,7 @@
         </w:numPr>
       </w:pPr>
       <w:r>
-        <w:t>Copy the published files and put it</w:t>
-      </w:r>
-      <w:r>
-        <w:t xml:space="preserve"> the following folder on the web server: </w:t>
+        <w:t xml:space="preserve">Copy the published files and put it the following folder on the web server: </w:t>
       </w:r>
     </w:p>
     <w:p>
@@ -149,7 +146,7 @@
         <w:ind w:left="720"/>
       </w:pPr>
       <w:r>
-        <w:t>C:\KenHr</w:t>
+        <w:t>C:\KenHR\Publish</w:t>
       </w:r>
     </w:p>
     <w:p>
@@ -249,13 +246,8 @@
         </w:numPr>
       </w:pPr>
       <w:proofErr w:type="spellStart"/>
-      <w:proofErr w:type="gramStart"/>
-      <w:r>
-        <w:t>KenHRApp.Web.runtimeconfig</w:t>
-      </w:r>
-      <w:proofErr w:type="gramEnd"/>
-      <w:r>
-        <w:t>.json</w:t>
+      <w:r>
+        <w:t>KenHRApp.Web.runtimeconfig.json</w:t>
       </w:r>
       <w:proofErr w:type="spellEnd"/>
     </w:p>
@@ -268,13 +260,8 @@
         </w:numPr>
       </w:pPr>
       <w:proofErr w:type="spellStart"/>
-      <w:proofErr w:type="gramStart"/>
-      <w:r>
-        <w:t>KenHRApp.Web.deps</w:t>
-      </w:r>
-      <w:proofErr w:type="gramEnd"/>
-      <w:r>
-        <w:t>.json</w:t>
+      <w:r>
+        <w:t>KenHRApp.Web.deps.json</w:t>
       </w:r>
       <w:proofErr w:type="spellEnd"/>
     </w:p>
@@ -287,13 +274,8 @@
         </w:numPr>
       </w:pPr>
       <w:proofErr w:type="spellStart"/>
-      <w:proofErr w:type="gramStart"/>
-      <w:r>
-        <w:t>appsettings.production</w:t>
-      </w:r>
-      <w:proofErr w:type="gramEnd"/>
-      <w:r>
-        <w:t>.json</w:t>
+      <w:r>
+        <w:t>appsettings.production.json</w:t>
       </w:r>
       <w:proofErr w:type="spellEnd"/>
     </w:p>
@@ -306,12 +288,10 @@
         </w:numPr>
       </w:pPr>
       <w:proofErr w:type="spellStart"/>
-      <w:proofErr w:type="gramStart"/>
       <w:r>
         <w:t>appsettings.json</w:t>
       </w:r>
       <w:proofErr w:type="spellEnd"/>
-      <w:proofErr w:type="gramEnd"/>
     </w:p>
     <w:p>
       <w:pPr>
@@ -322,12 +302,10 @@
         </w:numPr>
       </w:pPr>
       <w:proofErr w:type="spellStart"/>
-      <w:proofErr w:type="gramStart"/>
       <w:r>
         <w:t>appsettings.Development.json</w:t>
       </w:r>
       <w:proofErr w:type="spellEnd"/>
-      <w:proofErr w:type="gramEnd"/>
     </w:p>
     <w:p>
       <w:pPr>
@@ -1354,6 +1332,7 @@
   <w:style w:type="character" w:default="1" w:styleId="DefaultParagraphFont">
     <w:name w:val="Default Paragraph Font"/>
     <w:uiPriority w:val="1"/>
+    <w:semiHidden/>
     <w:unhideWhenUsed/>
   </w:style>
   <w:style w:type="table" w:default="1" w:styleId="TableNormal">

</xml_diff>